<commit_message>
feat(generation-plan): execute approved plan via planId (one analysis)
Preview and generation are no longer two independent analyses. POST /plan
now caches the frozen artifacts (RequirementIntelligence + ScriptGenerationPlan)
under an opaque planId and returns it. POST /generate accepts planId and, when
it fingerprint-matches the request, EXECUTES the approved plan instead of
re-running the intelligence pipeline.

- generation-plan-store.ts: bounded, self-evicting (TTL + max size) cache of
  the frozen artifacts, keyed by planId, with a request fingerprint. Owns no
  intelligence. Graceful fallback to fresh analysis on miss/expiry/mismatch.
- /plan returns planId; /generate reuses it (reusedApprovedPlan telemetry).
- 6 unit tests for the store (save/retrieve, fingerprint stability + isolation).

Backend stays frozen — new adapter/store/route only.
</commit_message>
<xml_diff>
--- a/GENERATION_PLAN_SPRINT.docx
+++ b/GENERATION_PLAN_SPRINT.docx
@@ -2,7 +2,7 @@
 <file path=word/document.xml><?xml version="1.0" encoding="utf-8"?>
 <w:document xmlns:w="http://schemas.openxmlformats.org/wordprocessingml/2006/main" xmlns:m="http://schemas.openxmlformats.org/officeDocument/2006/math" xmlns:r="http://schemas.openxmlformats.org/officeDocument/2006/relationships" xmlns:o="urn:schemas-microsoft-com:office:office" xmlns:v="urn:schemas-microsoft-com:vml" xmlns:w10="urn:schemas-microsoft-com:office:word" xmlns:a="http://schemas.openxmlformats.org/drawingml/2006/main" xmlns:pic="http://schemas.openxmlformats.org/drawingml/2006/picture" xmlns:wp="http://schemas.openxmlformats.org/drawingml/2006/wordprocessingDrawing">
   <w:body>
-    <w:bookmarkStart w:id="25" w:name="generation-plan-sprint-summary"/>
+    <w:bookmarkStart w:id="26" w:name="generation-plan-sprint-summary"/>
     <w:p>
       <w:pPr>
         <w:pStyle w:val="Heading1"/>
@@ -296,7 +296,285 @@
       </w:r>
     </w:p>
     <w:bookmarkEnd w:id="20"/>
-    <w:bookmarkStart w:id="22" w:name="architecture-the-backend-stays-frozen"/>
+    <w:bookmarkStart w:id="21" w:name="one-analysis-one-execution-planid"/>
+    <w:p>
+      <w:pPr>
+        <w:pStyle w:val="Heading2"/>
+      </w:pPr>
+      <w:r>
+        <w:t xml:space="preserve">One analysis, one execution (planId)</w:t>
+      </w:r>
+    </w:p>
+    <w:p>
+      <w:pPr>
+        <w:pStyle w:val="FirstParagraph"/>
+      </w:pPr>
+      <w:r>
+        <w:t xml:space="preserve">Preview and generation are no longer two unrelated requests. The plan is computed</w:t>
+      </w:r>
+      <w:r>
+        <w:t xml:space="preserve"> </w:t>
+      </w:r>
+      <w:r>
+        <w:rPr>
+          <w:bCs/>
+          <w:b/>
+        </w:rPr>
+        <w:t xml:space="preserve">once</w:t>
+      </w:r>
+      <w:r>
+        <w:t xml:space="preserve"> </w:t>
+      </w:r>
+      <w:r>
+        <w:t xml:space="preserve">at</w:t>
+      </w:r>
+      <w:r>
+        <w:t xml:space="preserve"> </w:t>
+      </w:r>
+      <w:r>
+        <w:rPr>
+          <w:rStyle w:val="VerbatimChar"/>
+        </w:rPr>
+        <w:t xml:space="preserve">POST /plan</w:t>
+      </w:r>
+      <w:r>
+        <w:t xml:space="preserve">; the frozen artifacts (</w:t>
+      </w:r>
+      <w:r>
+        <w:rPr>
+          <w:rStyle w:val="VerbatimChar"/>
+        </w:rPr>
+        <w:t xml:space="preserve">RequirementIntelligence</w:t>
+      </w:r>
+      <w:r>
+        <w:t xml:space="preserve"> </w:t>
+      </w:r>
+      <w:r>
+        <w:t xml:space="preserve">+</w:t>
+      </w:r>
+      <w:r>
+        <w:t xml:space="preserve"> </w:t>
+      </w:r>
+      <w:r>
+        <w:rPr>
+          <w:rStyle w:val="VerbatimChar"/>
+        </w:rPr>
+        <w:t xml:space="preserve">ScriptGenerationPlan</w:t>
+      </w:r>
+      <w:r>
+        <w:t xml:space="preserve">) are cached under an opaque</w:t>
+      </w:r>
+      <w:r>
+        <w:t xml:space="preserve"> </w:t>
+      </w:r>
+      <w:r>
+        <w:rPr>
+          <w:rStyle w:val="VerbatimChar"/>
+        </w:rPr>
+        <w:t xml:space="preserve">planId</w:t>
+      </w:r>
+      <w:r>
+        <w:t xml:space="preserve">. When the customer approves,</w:t>
+      </w:r>
+      <w:r>
+        <w:t xml:space="preserve"> </w:t>
+      </w:r>
+      <w:r>
+        <w:rPr>
+          <w:rStyle w:val="VerbatimChar"/>
+        </w:rPr>
+        <w:t xml:space="preserve">POST /generate</w:t>
+      </w:r>
+      <w:r>
+        <w:t xml:space="preserve"> </w:t>
+      </w:r>
+      <w:r>
+        <w:t xml:space="preserve">is called with that</w:t>
+      </w:r>
+      <w:r>
+        <w:t xml:space="preserve"> </w:t>
+      </w:r>
+      <w:r>
+        <w:rPr>
+          <w:rStyle w:val="VerbatimChar"/>
+        </w:rPr>
+        <w:t xml:space="preserve">planId</w:t>
+      </w:r>
+      <w:r>
+        <w:t xml:space="preserve"> </w:t>
+      </w:r>
+      <w:r>
+        <w:t xml:space="preserve">and</w:t>
+      </w:r>
+      <w:r>
+        <w:t xml:space="preserve"> </w:t>
+      </w:r>
+      <w:r>
+        <w:rPr>
+          <w:bCs/>
+          <w:b/>
+        </w:rPr>
+        <w:t xml:space="preserve">executes the already-approved plan</w:t>
+      </w:r>
+      <w:r>
+        <w:t xml:space="preserve"> </w:t>
+      </w:r>
+      <w:r>
+        <w:t xml:space="preserve">instead of re-running the intelligence pipeline:</w:t>
+      </w:r>
+    </w:p>
+    <w:p>
+      <w:pPr>
+        <w:pStyle w:val="SourceCode"/>
+      </w:pPr>
+      <w:r>
+        <w:rPr>
+          <w:rStyle w:val="VerbatimChar"/>
+        </w:rPr>
+        <w:t xml:space="preserve">Generate Script → POST /plan ─────────────┐   (one analysis)</w:t>
+      </w:r>
+      <w:r>
+        <w:br/>
+      </w:r>
+      <w:r>
+        <w:rPr>
+          <w:rStyle w:val="VerbatimChar"/>
+        </w:rPr>
+        <w:t xml:space="preserve">                     ↓                      │</w:t>
+      </w:r>
+      <w:r>
+        <w:br/>
+      </w:r>
+      <w:r>
+        <w:rPr>
+          <w:rStyle w:val="VerbatimChar"/>
+        </w:rPr>
+        <w:t xml:space="preserve">                GenerationPlan (+ planId)   │</w:t>
+      </w:r>
+      <w:r>
+        <w:br/>
+      </w:r>
+      <w:r>
+        <w:rPr>
+          <w:rStyle w:val="VerbatimChar"/>
+        </w:rPr>
+        <w:t xml:space="preserve">                     ↓                      │</w:t>
+      </w:r>
+      <w:r>
+        <w:br/>
+      </w:r>
+      <w:r>
+        <w:rPr>
+          <w:rStyle w:val="VerbatimChar"/>
+        </w:rPr>
+        <w:t xml:space="preserve">                Execute → POST /generate ───┘   (reuses planId)</w:t>
+      </w:r>
+    </w:p>
+    <w:p>
+      <w:pPr>
+        <w:numPr>
+          <w:ilvl w:val="0"/>
+          <w:numId w:val="1003"/>
+        </w:numPr>
+        <w:pStyle w:val="Compact"/>
+      </w:pPr>
+      <w:r>
+        <w:rPr>
+          <w:rStyle w:val="VerbatimChar"/>
+        </w:rPr>
+        <w:t xml:space="preserve">generation-plan-store.ts</w:t>
+      </w:r>
+      <w:r>
+        <w:t xml:space="preserve"> </w:t>
+      </w:r>
+      <w:r>
+        <w:t xml:space="preserve">(NEW) — a bounded, self-evicting in-memory cache</w:t>
+      </w:r>
+      <w:r>
+        <w:t xml:space="preserve"> </w:t>
+      </w:r>
+      <w:r>
+        <w:t xml:space="preserve">(TTL + max size) of the frozen artifacts. Owns no intelligence.</w:t>
+      </w:r>
+    </w:p>
+    <w:p>
+      <w:pPr>
+        <w:numPr>
+          <w:ilvl w:val="0"/>
+          <w:numId w:val="1003"/>
+        </w:numPr>
+        <w:pStyle w:val="Compact"/>
+      </w:pPr>
+      <w:r>
+        <w:t xml:space="preserve">A</w:t>
+      </w:r>
+      <w:r>
+        <w:t xml:space="preserve"> </w:t>
+      </w:r>
+      <w:r>
+        <w:rPr>
+          <w:bCs/>
+          <w:b/>
+        </w:rPr>
+        <w:t xml:space="preserve">fingerprint</w:t>
+      </w:r>
+      <w:r>
+        <w:t xml:space="preserve"> </w:t>
+      </w:r>
+      <w:r>
+        <w:t xml:space="preserve">binds each plan to exactly the request it describes</w:t>
+      </w:r>
+      <w:r>
+        <w:t xml:space="preserve"> </w:t>
+      </w:r>
+      <w:r>
+        <w:t xml:space="preserve">(requirementId / testCaseId / repoId / testCaseIds). If a</w:t>
+      </w:r>
+      <w:r>
+        <w:t xml:space="preserve"> </w:t>
+      </w:r>
+      <w:r>
+        <w:rPr>
+          <w:rStyle w:val="VerbatimChar"/>
+        </w:rPr>
+        <w:t xml:space="preserve">planId</w:t>
+      </w:r>
+      <w:r>
+        <w:t xml:space="preserve"> </w:t>
+      </w:r>
+      <w:r>
+        <w:t xml:space="preserve">is missing,</w:t>
+      </w:r>
+      <w:r>
+        <w:t xml:space="preserve"> </w:t>
+      </w:r>
+      <w:r>
+        <w:t xml:space="preserve">expired, or fingerprint-mismatched,</w:t>
+      </w:r>
+      <w:r>
+        <w:t xml:space="preserve"> </w:t>
+      </w:r>
+      <w:r>
+        <w:rPr>
+          <w:rStyle w:val="VerbatimChar"/>
+        </w:rPr>
+        <w:t xml:space="preserve">/generate</w:t>
+      </w:r>
+      <w:r>
+        <w:t xml:space="preserve"> </w:t>
+      </w:r>
+      <w:r>
+        <w:t xml:space="preserve">degrades gracefully to a fresh</w:t>
+      </w:r>
+      <w:r>
+        <w:t xml:space="preserve"> </w:t>
+      </w:r>
+      <w:r>
+        <w:t xml:space="preserve">analysis — it never errors.</w:t>
+      </w:r>
+    </w:p>
+    <w:bookmarkEnd w:id="21"/>
+    <w:bookmarkStart w:id="23" w:name="architecture-the-backend-stays-frozen"/>
     <w:p>
       <w:pPr>
         <w:pStyle w:val="Heading2"/>
@@ -479,7 +757,7 @@
               <w:jc w:val="left"/>
             </w:pPr>
             <w:r>
-              <w:t xml:space="preserve">Backend route (NEW)</w:t>
+              <w:t xml:space="preserve">Backend store (NEW)</w:t>
             </w:r>
           </w:p>
         </w:tc>
@@ -494,22 +772,7 @@
               <w:rPr>
                 <w:rStyle w:val="VerbatimChar"/>
               </w:rPr>
-              <w:t xml:space="preserve">POST /api/scripts/plan</w:t>
-            </w:r>
-            <w:r>
-              <w:t xml:space="preserve"> </w:t>
-            </w:r>
-            <w:r>
-              <w:t xml:space="preserve">in</w:t>
-            </w:r>
-            <w:r>
-              <w:t xml:space="preserve"> </w:t>
-            </w:r>
-            <w:r>
-              <w:rPr>
-                <w:rStyle w:val="VerbatimChar"/>
-              </w:rPr>
-              <w:t xml:space="preserve">src/api/routes/script-gen.ts</w:t>
+              <w:t xml:space="preserve">src/requirement-intelligence/generation-plan-store.ts</w:t>
             </w:r>
           </w:p>
         </w:tc>
@@ -521,7 +784,7 @@
               <w:jc w:val="left"/>
             </w:pPr>
             <w:r>
-              <w:t xml:space="preserve">Read-only. Resolves test cases, loads the repo coverage model, runs the frozen</w:t>
+              <w:t xml:space="preserve">Bounded, self-evicting cache of the frozen artifacts under a</w:t>
             </w:r>
             <w:r>
               <w:t xml:space="preserve"> </w:t>
@@ -530,37 +793,10 @@
               <w:rPr>
                 <w:rStyle w:val="VerbatimChar"/>
               </w:rPr>
-              <w:t xml:space="preserve">RequirementIntelligenceService</w:t>
-            </w:r>
-            <w:r>
-              <w:t xml:space="preserve"> </w:t>
-            </w:r>
-            <w:r>
-              <w:t xml:space="preserve">+</w:t>
-            </w:r>
-            <w:r>
-              <w:t xml:space="preserve"> </w:t>
-            </w:r>
-            <w:r>
-              <w:rPr>
-                <w:rStyle w:val="VerbatimChar"/>
-              </w:rPr>
-              <w:t xml:space="preserve">ScriptGenerationConsumer</w:t>
-            </w:r>
-            <w:r>
-              <w:t xml:space="preserve">, then</w:t>
-            </w:r>
-            <w:r>
-              <w:t xml:space="preserve"> </w:t>
-            </w:r>
-            <w:r>
-              <w:rPr>
-                <w:rStyle w:val="VerbatimChar"/>
-              </w:rPr>
-              <w:t xml:space="preserve">buildGenerationPlanView(...)</w:t>
-            </w:r>
-            <w:r>
-              <w:t xml:space="preserve">. Generates nothing. Falls back to a GENERATE-all view when there is no coverage model / no test cases.</w:t>
+              <w:t xml:space="preserve">planId</w:t>
+            </w:r>
+            <w:r>
+              <w:t xml:space="preserve">, so approval executes the same analysis (see above). Owns no intelligence.</w:t>
             </w:r>
           </w:p>
         </w:tc>
@@ -574,7 +810,7 @@
               <w:jc w:val="left"/>
             </w:pPr>
             <w:r>
-              <w:t xml:space="preserve">Frontend proxy (NEW)</w:t>
+              <w:t xml:space="preserve">Backend route (NEW)</w:t>
             </w:r>
           </w:p>
         </w:tc>
@@ -589,7 +825,22 @@
               <w:rPr>
                 <w:rStyle w:val="VerbatimChar"/>
               </w:rPr>
-              <w:t xml:space="preserve">app/api/scripts/plan/route.ts</w:t>
+              <w:t xml:space="preserve">POST /api/scripts/plan</w:t>
+            </w:r>
+            <w:r>
+              <w:t xml:space="preserve"> </w:t>
+            </w:r>
+            <w:r>
+              <w:t xml:space="preserve">in</w:t>
+            </w:r>
+            <w:r>
+              <w:t xml:space="preserve"> </w:t>
+            </w:r>
+            <w:r>
+              <w:rPr>
+                <w:rStyle w:val="VerbatimChar"/>
+              </w:rPr>
+              <w:t xml:space="preserve">src/api/routes/script-gen.ts</w:t>
             </w:r>
           </w:p>
         </w:tc>
@@ -601,7 +852,46 @@
               <w:jc w:val="left"/>
             </w:pPr>
             <w:r>
-              <w:t xml:space="preserve">Forwards to the backend, carrying session cookie + project/environment/sprint headers.</w:t>
+              <w:t xml:space="preserve">Read-only. Resolves test cases, loads the repo coverage model, runs the frozen</w:t>
+            </w:r>
+            <w:r>
+              <w:t xml:space="preserve"> </w:t>
+            </w:r>
+            <w:r>
+              <w:rPr>
+                <w:rStyle w:val="VerbatimChar"/>
+              </w:rPr>
+              <w:t xml:space="preserve">RequirementIntelligenceService</w:t>
+            </w:r>
+            <w:r>
+              <w:t xml:space="preserve"> </w:t>
+            </w:r>
+            <w:r>
+              <w:t xml:space="preserve">+</w:t>
+            </w:r>
+            <w:r>
+              <w:t xml:space="preserve"> </w:t>
+            </w:r>
+            <w:r>
+              <w:rPr>
+                <w:rStyle w:val="VerbatimChar"/>
+              </w:rPr>
+              <w:t xml:space="preserve">ScriptGenerationConsumer</w:t>
+            </w:r>
+            <w:r>
+              <w:t xml:space="preserve">, then</w:t>
+            </w:r>
+            <w:r>
+              <w:t xml:space="preserve"> </w:t>
+            </w:r>
+            <w:r>
+              <w:rPr>
+                <w:rStyle w:val="VerbatimChar"/>
+              </w:rPr>
+              <w:t xml:space="preserve">buildGenerationPlanView(...)</w:t>
+            </w:r>
+            <w:r>
+              <w:t xml:space="preserve">. Generates nothing. Falls back to a GENERATE-all view when there is no coverage model / no test cases.</w:t>
             </w:r>
           </w:p>
         </w:tc>
@@ -615,7 +905,7 @@
               <w:jc w:val="left"/>
             </w:pPr>
             <w:r>
-              <w:t xml:space="preserve">Frontend UI (NEW)</w:t>
+              <w:t xml:space="preserve">Frontend proxy (NEW)</w:t>
             </w:r>
           </w:p>
         </w:tc>
@@ -630,7 +920,7 @@
               <w:rPr>
                 <w:rStyle w:val="VerbatimChar"/>
               </w:rPr>
-              <w:t xml:space="preserve">app/scripts/_components/generation-plan.tsx</w:t>
+              <w:t xml:space="preserve">app/api/scripts/plan/route.ts</w:t>
             </w:r>
           </w:p>
         </w:tc>
@@ -642,16 +932,7 @@
               <w:jc w:val="left"/>
             </w:pPr>
             <w:r>
-              <w:rPr>
-                <w:rStyle w:val="VerbatimChar"/>
-              </w:rPr>
-              <w:t xml:space="preserve">GenerationPlanPanel</w:t>
-            </w:r>
-            <w:r>
-              <w:t xml:space="preserve"> </w:t>
-            </w:r>
-            <w:r>
-              <w:t xml:space="preserve">— the analyzing sequence, metric tiles, expandable covered-flow rows, assets-reused list, decision narrative, savings comparison, Back / Execute buttons.</w:t>
+              <w:t xml:space="preserve">Forwards to the backend, carrying session cookie + project/environment/sprint headers.</w:t>
             </w:r>
           </w:p>
         </w:tc>
@@ -665,7 +946,7 @@
               <w:jc w:val="left"/>
             </w:pPr>
             <w:r>
-              <w:t xml:space="preserve">Frontend wiring</w:t>
+              <w:t xml:space="preserve">Frontend UI (NEW)</w:t>
             </w:r>
           </w:p>
         </w:tc>
@@ -680,7 +961,7 @@
               <w:rPr>
                 <w:rStyle w:val="VerbatimChar"/>
               </w:rPr>
-              <w:t xml:space="preserve">app/scripts/_components/script-generator.tsx</w:t>
+              <w:t xml:space="preserve">app/scripts/_components/generation-plan.tsx</w:t>
             </w:r>
           </w:p>
         </w:tc>
@@ -692,6 +973,56 @@
               <w:jc w:val="left"/>
             </w:pPr>
             <w:r>
+              <w:rPr>
+                <w:rStyle w:val="VerbatimChar"/>
+              </w:rPr>
+              <w:t xml:space="preserve">GenerationPlanPanel</w:t>
+            </w:r>
+            <w:r>
+              <w:t xml:space="preserve"> </w:t>
+            </w:r>
+            <w:r>
+              <w:t xml:space="preserve">— the analyzing sequence, metric tiles, expandable covered-flow rows, assets-reused list, decision narrative, savings comparison, Back / Execute buttons.</w:t>
+            </w:r>
+          </w:p>
+        </w:tc>
+      </w:tr>
+      <w:tr>
+        <w:tc>
+          <w:tcPr/>
+          <w:p>
+            <w:pPr>
+              <w:pStyle w:val="Compact"/>
+              <w:jc w:val="left"/>
+            </w:pPr>
+            <w:r>
+              <w:t xml:space="preserve">Frontend wiring</w:t>
+            </w:r>
+          </w:p>
+        </w:tc>
+        <w:tc>
+          <w:tcPr/>
+          <w:p>
+            <w:pPr>
+              <w:pStyle w:val="Compact"/>
+              <w:jc w:val="left"/>
+            </w:pPr>
+            <w:r>
+              <w:rPr>
+                <w:rStyle w:val="VerbatimChar"/>
+              </w:rPr>
+              <w:t xml:space="preserve">app/scripts/_components/script-generator.tsx</w:t>
+            </w:r>
+          </w:p>
+        </w:tc>
+        <w:tc>
+          <w:tcPr/>
+          <w:p>
+            <w:pPr>
+              <w:pStyle w:val="Compact"/>
+              <w:jc w:val="left"/>
+            </w:pPr>
+            <w:r>
               <w:t xml:space="preserve">“</w:t>
             </w:r>
             <w:r>
@@ -741,7 +1072,7 @@
         </w:tc>
       </w:tr>
     </w:tbl>
-    <w:bookmarkStart w:id="21" w:name="the-frozen-contract-this-renders"/>
+    <w:bookmarkStart w:id="22" w:name="the-frozen-contract-this-renders"/>
     <w:p>
       <w:pPr>
         <w:pStyle w:val="Heading3"/>
@@ -890,92 +1221,15 @@
         <w:t xml:space="preserve">tied to covered flows, not a new reuse engine.</w:t>
       </w:r>
     </w:p>
-    <w:bookmarkEnd w:id="21"/>
     <w:bookmarkEnd w:id="22"/>
-    <w:bookmarkStart w:id="23" w:name="honesty-guarantees"/>
+    <w:bookmarkEnd w:id="23"/>
+    <w:bookmarkStart w:id="24" w:name="honesty-guarantees"/>
     <w:p>
       <w:pPr>
         <w:pStyle w:val="Heading2"/>
       </w:pPr>
       <w:r>
         <w:t xml:space="preserve">Honesty guarantees</w:t>
-      </w:r>
-    </w:p>
-    <w:p>
-      <w:pPr>
-        <w:numPr>
-          <w:ilvl w:val="0"/>
-          <w:numId w:val="1003"/>
-        </w:numPr>
-        <w:pStyle w:val="Compact"/>
-      </w:pPr>
-      <w:r>
-        <w:t xml:space="preserve">Token figures are</w:t>
-      </w:r>
-      <w:r>
-        <w:t xml:space="preserve"> </w:t>
-      </w:r>
-      <w:r>
-        <w:rPr>
-          <w:bCs/>
-          <w:b/>
-        </w:rPr>
-        <w:t xml:space="preserve">estimates</w:t>
-      </w:r>
-      <w:r>
-        <w:t xml:space="preserve"> </w:t>
-      </w:r>
-      <w:r>
-        <w:t xml:space="preserve">(</w:t>
-      </w:r>
-      <w:r>
-        <w:rPr>
-          <w:rStyle w:val="VerbatimChar"/>
-        </w:rPr>
-        <w:t xml:space="preserve">ESTIMATED_TOKENS_PER_FLOW × scripts</w:t>
-      </w:r>
-      <w:r>
-        <w:t xml:space="preserve">) and are labeled as</w:t>
-      </w:r>
-      <w:r>
-        <w:t xml:space="preserve"> </w:t>
-      </w:r>
-      <w:r>
-        <w:t xml:space="preserve">estimates in the UI — never presented as measured values.</w:t>
-      </w:r>
-    </w:p>
-    <w:p>
-      <w:pPr>
-        <w:numPr>
-          <w:ilvl w:val="0"/>
-          <w:numId w:val="1003"/>
-        </w:numPr>
-        <w:pStyle w:val="Compact"/>
-      </w:pPr>
-      <w:r>
-        <w:t xml:space="preserve">The adapter is presentation-only and deterministic; it cannot inflate coverage or</w:t>
-      </w:r>
-      <w:r>
-        <w:t xml:space="preserve"> </w:t>
-      </w:r>
-      <w:r>
-        <w:t xml:space="preserve">fabricate reused assets — every asset shown is one the Coverage Model already attributes</w:t>
-      </w:r>
-      <w:r>
-        <w:t xml:space="preserve"> </w:t>
-      </w:r>
-      <w:r>
-        <w:t xml:space="preserve">to a covered flow.</w:t>
-      </w:r>
-    </w:p>
-    <w:bookmarkEnd w:id="23"/>
-    <w:bookmarkStart w:id="24" w:name="validation"/>
-    <w:p>
-      <w:pPr>
-        <w:pStyle w:val="Heading2"/>
-      </w:pPr>
-      <w:r>
-        <w:t xml:space="preserve">Validation</w:t>
       </w:r>
     </w:p>
     <w:p>
@@ -987,22 +1241,7 @@
         <w:pStyle w:val="Compact"/>
       </w:pPr>
       <w:r>
-        <w:t xml:space="preserve">Backend</w:t>
-      </w:r>
-      <w:r>
-        <w:t xml:space="preserve"> </w:t>
-      </w:r>
-      <w:r>
-        <w:rPr>
-          <w:rStyle w:val="VerbatimChar"/>
-        </w:rPr>
-        <w:t xml:space="preserve">npx tsc --noEmit</w:t>
-      </w:r>
-      <w:r>
-        <w:t xml:space="preserve"> </w:t>
-      </w:r>
-      <w:r>
-        <w:t xml:space="preserve">—</w:t>
+        <w:t xml:space="preserve">Token figures are</w:t>
       </w:r>
       <w:r>
         <w:t xml:space="preserve"> </w:t>
@@ -1012,10 +1251,28 @@
           <w:bCs/>
           <w:b/>
         </w:rPr>
-        <w:t xml:space="preserve">exit 0</w:t>
-      </w:r>
-      <w:r>
-        <w:t xml:space="preserve">.</w:t>
+        <w:t xml:space="preserve">estimates</w:t>
+      </w:r>
+      <w:r>
+        <w:t xml:space="preserve"> </w:t>
+      </w:r>
+      <w:r>
+        <w:t xml:space="preserve">(</w:t>
+      </w:r>
+      <w:r>
+        <w:rPr>
+          <w:rStyle w:val="VerbatimChar"/>
+        </w:rPr>
+        <w:t xml:space="preserve">ESTIMATED_TOKENS_PER_FLOW × scripts</w:t>
+      </w:r>
+      <w:r>
+        <w:t xml:space="preserve">) and are labeled as</w:t>
+      </w:r>
+      <w:r>
+        <w:t xml:space="preserve"> </w:t>
+      </w:r>
+      <w:r>
+        <w:t xml:space="preserve">estimates in the UI — never presented as measured values.</w:t>
       </w:r>
     </w:p>
     <w:p>
@@ -1027,7 +1284,41 @@
         <w:pStyle w:val="Compact"/>
       </w:pPr>
       <w:r>
-        <w:t xml:space="preserve">Frontend</w:t>
+        <w:t xml:space="preserve">The adapter is presentation-only and deterministic; it cannot inflate coverage or</w:t>
+      </w:r>
+      <w:r>
+        <w:t xml:space="preserve"> </w:t>
+      </w:r>
+      <w:r>
+        <w:t xml:space="preserve">fabricate reused assets — every asset shown is one the Coverage Model already attributes</w:t>
+      </w:r>
+      <w:r>
+        <w:t xml:space="preserve"> </w:t>
+      </w:r>
+      <w:r>
+        <w:t xml:space="preserve">to a covered flow.</w:t>
+      </w:r>
+    </w:p>
+    <w:bookmarkEnd w:id="24"/>
+    <w:bookmarkStart w:id="25" w:name="validation"/>
+    <w:p>
+      <w:pPr>
+        <w:pStyle w:val="Heading2"/>
+      </w:pPr>
+      <w:r>
+        <w:t xml:space="preserve">Validation</w:t>
+      </w:r>
+    </w:p>
+    <w:p>
+      <w:pPr>
+        <w:numPr>
+          <w:ilvl w:val="0"/>
+          <w:numId w:val="1005"/>
+        </w:numPr>
+        <w:pStyle w:val="Compact"/>
+      </w:pPr>
+      <w:r>
+        <w:t xml:space="preserve">Backend</w:t>
       </w:r>
       <w:r>
         <w:t xml:space="preserve"> </w:t>
@@ -1062,15 +1353,21 @@
       <w:pPr>
         <w:numPr>
           <w:ilvl w:val="0"/>
-          <w:numId w:val="1004"/>
+          <w:numId w:val="1005"/>
         </w:numPr>
         <w:pStyle w:val="Compact"/>
       </w:pPr>
       <w:r>
-        <w:rPr>
-          <w:rStyle w:val="VerbatimChar"/>
-        </w:rPr>
-        <w:t xml:space="preserve">tests/unit/generation-plan-view.test.ts</w:t>
+        <w:t xml:space="preserve">Frontend</w:t>
+      </w:r>
+      <w:r>
+        <w:t xml:space="preserve"> </w:t>
+      </w:r>
+      <w:r>
+        <w:rPr>
+          <w:rStyle w:val="VerbatimChar"/>
+        </w:rPr>
+        <w:t xml:space="preserve">npx tsc --noEmit</w:t>
       </w:r>
       <w:r>
         <w:t xml:space="preserve"> </w:t>
@@ -1086,60 +1383,137 @@
           <w:bCs/>
           <w:b/>
         </w:rPr>
-        <w:t xml:space="preserve">8/8 passing</w:t>
-      </w:r>
-      <w:r>
-        <w:t xml:space="preserve"> </w:t>
-      </w:r>
-      <w:r>
-        <w:t xml:space="preserve">(EXTEND, SKIP, GENERATE paths:</w:t>
-      </w:r>
-      <w:r>
-        <w:t xml:space="preserve"> </w:t>
-      </w:r>
-      <w:r>
-        <w:t xml:space="preserve">covered-flow assets, missing flows, reused page objects + helpers, savings comparison,</w:t>
-      </w:r>
-      <w:r>
-        <w:t xml:space="preserve"> </w:t>
-      </w:r>
-      <w:r>
-        <w:t xml:space="preserve">narrative-is-</w:t>
-      </w:r>
-      <w:r>
-        <w:t xml:space="preserve">“</w:t>
-      </w:r>
-      <w:r>
-        <w:t xml:space="preserve">what</w:t>
-      </w:r>
-      <w:r>
-        <w:t xml:space="preserve">”</w:t>
-      </w:r>
-      <w:r>
-        <w:t xml:space="preserve">-not-</w:t>
-      </w:r>
-      <w:r>
-        <w:t xml:space="preserve">“</w:t>
-      </w:r>
-      <w:r>
-        <w:t xml:space="preserve">why</w:t>
-      </w:r>
-      <w:r>
-        <w:t xml:space="preserve">”</w:t>
-      </w:r>
-      <w:r>
-        <w:t xml:space="preserve">).</w:t>
+        <w:t xml:space="preserve">exit 0</w:t>
+      </w:r>
+      <w:r>
+        <w:t xml:space="preserve">.</w:t>
       </w:r>
     </w:p>
     <w:p>
       <w:pPr>
         <w:numPr>
           <w:ilvl w:val="0"/>
-          <w:numId w:val="1004"/>
+          <w:numId w:val="1005"/>
         </w:numPr>
         <w:pStyle w:val="Compact"/>
       </w:pPr>
       <w:r>
+        <w:rPr>
+          <w:rStyle w:val="VerbatimChar"/>
+        </w:rPr>
+        <w:t xml:space="preserve">tests/unit/generation-plan-view.test.ts</w:t>
+      </w:r>
+      <w:r>
+        <w:t xml:space="preserve"> </w:t>
+      </w:r>
+      <w:r>
+        <w:t xml:space="preserve">—</w:t>
+      </w:r>
+      <w:r>
+        <w:t xml:space="preserve"> </w:t>
+      </w:r>
+      <w:r>
+        <w:rPr>
+          <w:bCs/>
+          <w:b/>
+        </w:rPr>
+        <w:t xml:space="preserve">8/8 passing</w:t>
+      </w:r>
+      <w:r>
+        <w:t xml:space="preserve"> </w:t>
+      </w:r>
+      <w:r>
+        <w:t xml:space="preserve">(EXTEND, SKIP, GENERATE paths:</w:t>
+      </w:r>
+      <w:r>
+        <w:t xml:space="preserve"> </w:t>
+      </w:r>
+      <w:r>
+        <w:t xml:space="preserve">covered-flow assets, missing flows, reused page objects + helpers, savings comparison,</w:t>
+      </w:r>
+      <w:r>
+        <w:t xml:space="preserve"> </w:t>
+      </w:r>
+      <w:r>
+        <w:t xml:space="preserve">narrative-is-</w:t>
+      </w:r>
+      <w:r>
+        <w:t xml:space="preserve">“</w:t>
+      </w:r>
+      <w:r>
+        <w:t xml:space="preserve">what</w:t>
+      </w:r>
+      <w:r>
+        <w:t xml:space="preserve">”</w:t>
+      </w:r>
+      <w:r>
+        <w:t xml:space="preserve">-not-</w:t>
+      </w:r>
+      <w:r>
+        <w:t xml:space="preserve">“</w:t>
+      </w:r>
+      <w:r>
+        <w:t xml:space="preserve">why</w:t>
+      </w:r>
+      <w:r>
+        <w:t xml:space="preserve">”</w:t>
+      </w:r>
+      <w:r>
+        <w:t xml:space="preserve">).</w:t>
+      </w:r>
+    </w:p>
+    <w:p>
+      <w:pPr>
+        <w:numPr>
+          <w:ilvl w:val="0"/>
+          <w:numId w:val="1005"/>
+        </w:numPr>
+        <w:pStyle w:val="Compact"/>
+      </w:pPr>
+      <w:r>
+        <w:rPr>
+          <w:rStyle w:val="VerbatimChar"/>
+        </w:rPr>
+        <w:t xml:space="preserve">tests/unit/generation-plan-store.test.ts</w:t>
+      </w:r>
+      <w:r>
+        <w:t xml:space="preserve"> </w:t>
+      </w:r>
+      <w:r>
+        <w:t xml:space="preserve">—</w:t>
+      </w:r>
+      <w:r>
+        <w:t xml:space="preserve"> </w:t>
+      </w:r>
+      <w:r>
+        <w:rPr>
+          <w:bCs/>
+          <w:b/>
+        </w:rPr>
+        <w:t xml:space="preserve">6/6 passing</w:t>
+      </w:r>
+      <w:r>
+        <w:t xml:space="preserve"> </w:t>
+      </w:r>
+      <w:r>
+        <w:t xml:space="preserve">(save/retrieve, unknown id,</w:t>
+      </w:r>
+      <w:r>
+        <w:t xml:space="preserve"> </w:t>
+      </w:r>
+      <w:r>
+        <w:t xml:space="preserve">fingerprint stability + isolation, id coercion, fingerprint-mismatch → no reuse).</w:t>
+      </w:r>
+    </w:p>
+    <w:p>
+      <w:pPr>
+        <w:numPr>
+          <w:ilvl w:val="0"/>
+          <w:numId w:val="1005"/>
+        </w:numPr>
+        <w:pStyle w:val="Compact"/>
+      </w:pPr>
+      <w:r>
         <w:t xml:space="preserve">Pre-existing unrelated failures (</w:t>
       </w:r>
       <w:r>
@@ -1182,8 +1556,8 @@
         <w:t xml:space="preserve">) were not touched by this sprint.</w:t>
       </w:r>
     </w:p>
-    <w:bookmarkEnd w:id="24"/>
     <w:bookmarkEnd w:id="25"/>
+    <w:bookmarkEnd w:id="26"/>
     <w:sectPr/>
   </w:body>
 </w:document>
@@ -1491,6 +1865,9 @@
     <w:abstractNumId w:val="991"/>
   </w:num>
   <w:num w:numId="1004">
+    <w:abstractNumId w:val="991"/>
+  </w:num>
+  <w:num w:numId="1005">
     <w:abstractNumId w:val="991"/>
   </w:num>
 </w:numbering>

</xml_diff>